<commit_message>
docs: update SPPP and risk register for Iteration 2
</commit_message>
<xml_diff>
--- a/doc/CS673_SPPP_team2.docx
+++ b/doc/CS673_SPPP_team2.docx
@@ -1910,6 +1910,17 @@
             </w:pPr>
             <w:r>
               <w:rPr>
+                <w:b w:val="1"/>
+                <w:bCs w:val="1"/>
+                <w:sz w:val="24"/>
+                <w:szCs w:val="24"/>
+                <w:u w:val="single"/>
+                <w:rtl w:val="0"/>
+              </w:rPr>
+              <w:t xml:space="preserve">3</w:t>
+            </w:r>
+            <w:r>
+              <w:rPr>
                 <w:rtl w:val="0"/>
               </w:rPr>
             </w:r>
@@ -1961,6 +1972,17 @@
             </w:pPr>
             <w:r>
               <w:rPr>
+                <w:b w:val="1"/>
+                <w:bCs w:val="1"/>
+                <w:sz w:val="24"/>
+                <w:szCs w:val="24"/>
+                <w:u w:val="single"/>
+                <w:rtl w:val="0"/>
+              </w:rPr>
+              <w:t xml:space="preserve">Duc Anh Nguyen</w:t>
+            </w:r>
+            <w:r>
+              <w:rPr>
                 <w:rtl w:val="0"/>
               </w:rPr>
             </w:r>
@@ -2012,6 +2034,17 @@
             </w:pPr>
             <w:r>
               <w:rPr>
+                <w:b w:val="1"/>
+                <w:bCs w:val="1"/>
+                <w:sz w:val="24"/>
+                <w:szCs w:val="24"/>
+                <w:u w:val="single"/>
+                <w:rtl w:val="0"/>
+              </w:rPr>
+              <w:t xml:space="preserve">10/06</w:t>
+            </w:r>
+            <w:r>
+              <w:rPr>
                 <w:rtl w:val="0"/>
               </w:rPr>
             </w:r>
@@ -2061,6 +2094,17 @@
                 <w:vertAlign w:val="baseline"/>
               </w:rPr>
             </w:pPr>
+            <w:r>
+              <w:rPr>
+                <w:b w:val="1"/>
+                <w:bCs w:val="1"/>
+                <w:sz w:val="24"/>
+                <w:szCs w:val="24"/>
+                <w:u w:val="single"/>
+                <w:rtl w:val="0"/>
+              </w:rPr>
+              <w:t xml:space="preserve">Revision accompanying Iteration 2 delivery and Iteration 1 feedback. Jira replaces GitHub Issues as the project tracker throughout. Timeline updated with Iteration 2 actuals: study mode delivered end to end, and AI deck generation moved to Iteration 3. Scheduling described as Anki’s default algorithm. Configuration management, CI/CD, testing tools, and QA metrics updated to match the pipeline in use (Vitest and React Testing Library, 90% coverage gates on backend and frontend, image scanning). Risk register updated with two realized risks. AI usage log updated.</w:t>
+            </w:r>
             <w:r>
               <w:rPr>
                 <w:rtl w:val="0"/>
@@ -2308,7 +2352,7 @@
     </w:p>
     <w:sdt>
       <w:sdtPr>
-        <w:id w:val="1040622377"/>
+        <w:id w:val="651923823"/>
         <w:docPartObj>
           <w:docPartGallery w:val="Table of Contents"/>
           <w:docPartUnique w:val="1"/>
@@ -2377,7 +2421,7 @@
     </w:p>
     <w:sdt>
       <w:sdtPr>
-        <w:id w:val="1619750269"/>
+        <w:id w:val="-283181334"/>
         <w:docPartObj>
           <w:docPartGallery w:val="Table of Contents"/>
           <w:docPartUnique w:val="1"/>
@@ -3303,7 +3347,7 @@
         <w:rPr>
           <w:rtl w:val="0"/>
         </w:rPr>
-        <w:t xml:space="preserve"> The system tracks per-card performance and schedules each card’s next review using the SM-2 algorithm, so material is revisited at the interval where reinforcement is most valuable.</w:t>
+        <w:t xml:space="preserve"> The system tracks per-card performance and schedules each card’s next review using Anki’s default scheduling algorithm, which is derived from SM-2, so material is revisited at the interval where reinforcement is most valuable.</w:t>
       </w:r>
     </w:p>
     <w:p>
@@ -6194,6 +6238,19 @@
           <w:rtl w:val="0"/>
         </w:rPr>
         <w:t xml:space="preserve"> The personnel risk recorded in the register as “Loss team members” occurred on 9/12 when two of six members left the course. The mitigation recorded in the register — redefine scope and redistribute tasks — was executed: roles were reassigned as shown on the cover page, and project scope was reduced as recorded in §3a, which removed five features from scope and moved two others to a lower tier. The register entry has been reopened and rescored to reflect the remaining exposure, since the loss of further members would now have a greater impact on a four-person team than it would have on six.</w:t>
+      </w:r>
+    </w:p>
+    <w:p>
+      <w:pPr>
+        <w:spacing w:after="240" w:before="240" w:lineRule="auto"/>
+        <w:ind w:left="1440" w:firstLine="0"/>
+        <w:rPr/>
+      </w:pPr>
+      <w:r>
+        <w:rPr>
+          <w:rtl w:val="0"/>
+        </w:rPr>
+        <w:t xml:space="preserve">In Iteration 2, two further risks were realized and handled. Improper planning: AI deck generation, planned for Iteration 2, was moved to Iteration 3 so that study mode could be delivered complete. Third-party dependencies: a new SQLAlchemy release broke every PostgreSQL connection, and newly published OpenSSL vulnerabilities failed the image scan on develop. The first was fixed by pinning the dependency and the second by always rebuilding the image layer that applies OS updates. Both are recorded in the register.</w:t>
       </w:r>
     </w:p>
     <w:p>
@@ -6728,13 +6785,7 @@
                 <w:bCs w:val="1"/>
                 <w:rtl w:val="0"/>
               </w:rPr>
-              <w:t xml:space="preserve">Essential:</w:t>
-            </w:r>
-            <w:r>
-              <w:rPr>
-                <w:rtl w:val="0"/>
-              </w:rPr>
-              <w:t xml:space="preserve"> interactive study interface; SM-2 spaced-repetition scheduling; AI deck generation from natural-language prompts, with provenance labelling</w:t>
+              <w:t xml:space="preserve">Essential, delivered: interactive study interface (one card at a time, reveal, four rating buttons that show when each rating brings the card back, keyboard shortcuts, session summary); spaced-repetition scheduling with Anki’s default algorithm; due counts on each deck and a schedule badge on each card. Moved to Iteration 3: AI deck generation and AI deck review, so that study mode could be finished end to end with four members.</w:t>
             </w:r>
             <w:r>
               <w:rPr>
@@ -6776,7 +6827,7 @@
               <w:rPr>
                 <w:rtl w:val="0"/>
               </w:rPr>
-              <w:t xml:space="preserve">Extend the data model with scheduling and provenance columns; agree the API contract additions for study and generation; integrate the LLM service behind a bounded server-side interface; implement schema validation of model output; connect the deck and card interface to the live API; expand unit and integration testing</w:t>
+              <w:t xml:space="preserve">Added scheduling columns to the card model (migration 0002); added the due-cards and review endpoints; built the study page on a tested session reducer; gave every page one design system; added demo data with cards in every state (flask seed --reset, flask time-travel); moved frontend tests to Vitest and React Testing Library and covered every page; added a 90% frontend coverage gate; fixed a CI failure caused by OS package vulnerabilities in the frontend image</w:t>
             </w:r>
           </w:p>
         </w:tc>
@@ -6892,27 +6943,12 @@
                 <w:bCs w:val="1"/>
                 <w:rtl w:val="0"/>
               </w:rPr>
-              <w:t xml:space="preserve">Essential:</w:t>
+              <w:t xml:space="preserve">Essential: AI deck generation from a natural-language prompt, with preview and editing before saving, and provenance labelling. Desirable, if capacity allows: typed-answer study mode</w:t>
             </w:r>
             <w:r>
               <w:rPr>
                 <w:rtl w:val="0"/>
               </w:rPr>
-              <w:t xml:space="preserve"> complete or correct any unfinished essential requirements. </w:t>
-            </w:r>
-            <w:r>
-              <w:rPr>
-                <w:b w:val="1"/>
-                <w:bCs w:val="1"/>
-                <w:rtl w:val="0"/>
-              </w:rPr>
-              <w:t xml:space="preserve">Desirable:</w:t>
-            </w:r>
-            <w:r>
-              <w:rPr>
-                <w:rtl w:val="0"/>
-              </w:rPr>
-              <w:t xml:space="preserve"> typed-answer study mode and evaluation, if capacity allows</w:t>
             </w:r>
           </w:p>
         </w:tc>
@@ -6937,7 +6973,7 @@
               <w:rPr>
                 <w:rtl w:val="0"/>
               </w:rPr>
-              <w:t xml:space="preserve">System-wide testing; regression testing; defect resolution; interface cleanup; documentation; final integration; release preparation and demonstration</w:t>
+              <w:t xml:space="preserve">Integrate the LLM service behind a server-side interface with the limits in §3b(iii); validate model output before saving; system-wide and regression testing; defect resolution; documentation; release and demonstration</w:t>
             </w:r>
           </w:p>
         </w:tc>
@@ -7119,7 +7155,7 @@
         <w:rPr>
           <w:rtl w:val="0"/>
         </w:rPr>
-        <w:t xml:space="preserve"> — remote repository hosting, pull requests, code review, issue tracking, and collaboration.</w:t>
+        <w:t xml:space="preserve"> — remote repository hosting, pull requests, code review, and collaboration.</w:t>
       </w:r>
     </w:p>
     <w:p>
@@ -7269,13 +7305,12 @@
           <w:bCs w:val="1"/>
           <w:rtl w:val="0"/>
         </w:rPr>
-        <w:t xml:space="preserve">GitHub Actions</w:t>
-      </w:r>
-      <w:r>
-        <w:rPr>
-          <w:rtl w:val="0"/>
-        </w:rPr>
-        <w:t xml:space="preserve"> — the CI platform. Every push and pull request runs the backend test suite, the backend linter, and the frontend production build.</w:t>
+        <w:t xml:space="preserve">GitHub Actions — the CI/CD platform. Every push to develop or main and every pull request runs linting, the backend tests on SQLite and PostgreSQL, a migration check, the frontend tests and production build, and a Docker build with an image scan and a smoke test of the full stack (§5.2).</w:t>
+      </w:r>
+      <w:r>
+        <w:rPr>
+          <w:rtl w:val="0"/>
+        </w:rPr>
       </w:r>
     </w:p>
     <w:p>
@@ -7326,22 +7361,54 @@
           <w:ilvl w:val="0"/>
           <w:numId w:val="26"/>
         </w:numPr>
+        <w:spacing w:after="0" w:afterAutospacing="0" w:before="0" w:beforeAutospacing="0" w:lineRule="auto"/>
+        <w:ind w:left="2160" w:hanging="360"/>
+      </w:pPr>
+      <w:r>
+        <w:rPr>
+          <w:b w:val="1"/>
+          <w:bCs w:val="1"/>
+          <w:rtl w:val="0"/>
+        </w:rPr>
+        <w:t xml:space="preserve">pytest and pytest-cov</w:t>
+      </w:r>
+      <w:r>
+        <w:rPr>
+          <w:rtl w:val="0"/>
+        </w:rPr>
+        <w:t xml:space="preserve"> — the automated test suite and its statement-coverage measurement, reported on every CI run.</w:t>
+      </w:r>
+    </w:p>
+    <w:p>
+      <w:pPr>
+        <w:numPr>
+          <w:ilvl w:val="0"/>
+          <w:numId w:val="26"/>
+        </w:numPr>
+        <w:spacing w:after="0" w:afterAutospacing="0" w:before="0" w:beforeAutospacing="0" w:lineRule="auto"/>
+        <w:ind w:left="2160" w:hanging="360"/>
+      </w:pPr>
+      <w:r>
+        <w:rPr>
+          <w:rtl w:val="0"/>
+        </w:rPr>
+        <w:t xml:space="preserve">ESLint — JavaScript and JSX linting, run in CI.</w:t>
+      </w:r>
+    </w:p>
+    <w:p>
+      <w:pPr>
+        <w:numPr>
+          <w:ilvl w:val="0"/>
+          <w:numId w:val="26"/>
+        </w:numPr>
         <w:spacing w:after="240" w:before="0" w:beforeAutospacing="0" w:lineRule="auto"/>
         <w:ind w:left="2160" w:hanging="360"/>
       </w:pPr>
       <w:r>
         <w:rPr>
-          <w:b w:val="1"/>
-          <w:bCs w:val="1"/>
-          <w:rtl w:val="0"/>
-        </w:rPr>
-        <w:t xml:space="preserve">pytest and pytest-cov</w:t>
-      </w:r>
-      <w:r>
-        <w:rPr>
-          <w:rtl w:val="0"/>
-        </w:rPr>
-        <w:t xml:space="preserve"> — the automated test suite and its statement-coverage measurement, reported on every CI run.</w:t>
+          <w:rtl w:val="0"/>
+        </w:rPr>
+        <w:t xml:space="preserve">Vitest and React Testing Library — frontend unit and component tests, with statement coverage measured by @vitest/coverage-v8.</w:t>
       </w:r>
     </w:p>
     <w:p>
@@ -7392,22 +7459,38 @@
           <w:ilvl w:val="0"/>
           <w:numId w:val="12"/>
         </w:numPr>
+        <w:spacing w:after="0" w:afterAutospacing="0" w:before="0" w:beforeAutospacing="0" w:lineRule="auto"/>
+        <w:ind w:left="2160" w:hanging="360"/>
+      </w:pPr>
+      <w:r>
+        <w:rPr>
+          <w:b w:val="1"/>
+          <w:bCs w:val="1"/>
+          <w:rtl w:val="0"/>
+        </w:rPr>
+        <w:t xml:space="preserve">Dependabot</w:t>
+      </w:r>
+      <w:r>
+        <w:rPr>
+          <w:rtl w:val="0"/>
+        </w:rPr>
+        <w:t xml:space="preserve"> — monitors dependencies in both ecosystems for known vulnerabilities and opens update pull requests.</w:t>
+      </w:r>
+    </w:p>
+    <w:p>
+      <w:pPr>
+        <w:numPr>
+          <w:ilvl w:val="0"/>
+          <w:numId w:val="12"/>
+        </w:numPr>
         <w:spacing w:after="240" w:before="0" w:beforeAutospacing="0" w:lineRule="auto"/>
         <w:ind w:left="2160" w:hanging="360"/>
       </w:pPr>
       <w:r>
         <w:rPr>
-          <w:b w:val="1"/>
-          <w:bCs w:val="1"/>
-          <w:rtl w:val="0"/>
-        </w:rPr>
-        <w:t xml:space="preserve">Dependabot</w:t>
-      </w:r>
-      <w:r>
-        <w:rPr>
-          <w:rtl w:val="0"/>
-        </w:rPr>
-        <w:t xml:space="preserve"> — monitors dependencies in both ecosystems for known vulnerabilities and opens update pull requests.</w:t>
+          <w:rtl w:val="0"/>
+        </w:rPr>
+        <w:t xml:space="preserve">Trivy — scans both Docker images on every CI run and fails the build on any HIGH or CRITICAL vulnerability that has a fix available.</w:t>
       </w:r>
     </w:p>
     <w:p>
@@ -7566,17 +7649,17 @@
       </w:pPr>
       <w:r>
         <w:rPr>
-          <w:b w:val="1"/>
-          <w:bCs w:val="1"/>
-          <w:rtl w:val="0"/>
-        </w:rPr>
-        <w:t xml:space="preserve">GitHub Issues</w:t>
-      </w:r>
-      <w:r>
-        <w:rPr>
-          <w:rtl w:val="0"/>
-        </w:rPr>
-        <w:t xml:space="preserve"> — tracks tasks, defects, and enhancements.</w:t>
+          <w:rFonts w:ascii="Arial Unicode MS" w:cs="Arial Unicode MS" w:eastAsia="Arial Unicode MS" w:hAnsi="Arial Unicode MS"/>
+          <w:b w:val="1"/>
+          <w:bCs w:val="1"/>
+          <w:rtl w:val="0"/>
+        </w:rPr>
+        <w:t xml:space="preserve">Jira — tracks user stories, subtasks, and defects. Each iteration is a Jira sprint. Stories carry story points, an owner, and Given/When/Then acceptance tests, and move To Do → In Progress → In Review → Done. A story is Done when its pull request has merged and it has passed acceptance testing.</w:t>
+      </w:r>
+      <w:r>
+        <w:rPr>
+          <w:rtl w:val="0"/>
+        </w:rPr>
       </w:r>
     </w:p>
     <w:p>
@@ -7618,7 +7701,7 @@
           <w:bCs w:val="1"/>
           <w:rtl w:val="0"/>
         </w:rPr>
-        <w:t xml:space="preserve">Team group chat</w:t>
+        <w:t xml:space="preserve">Discord</w:t>
       </w:r>
       <w:r>
         <w:rPr>
@@ -7870,7 +7953,7 @@
         <w:rPr>
           <w:rtl w:val="0"/>
         </w:rPr>
-        <w:t xml:space="preserve">This workflow is enforced by a GitHub repository ruleset rather than by convention alone. Pull requests require at least one approving review before they can merge; approvals are dismissed when new commits are pushed; the automated “Backend tests” and “Frontend build” checks must pass; and the protected branches cannot be force-pushed or deleted.</w:t>
+        <w:t xml:space="preserve">This workflow is enforced by a GitHub repository ruleset rather than by convention alone. Pull requests require at least one approving review before they can merge; approvals are dismissed when new commits are pushed; the “CI passed” check, which succeeds only when every CI job has passed, is required; and the protected branches cannot be force-pushed or deleted.</w:t>
       </w:r>
     </w:p>
     <w:p>
@@ -7928,7 +8011,12 @@
         <w:rPr>
           <w:rtl w:val="0"/>
         </w:rPr>
-        <w:t xml:space="preserve">The project uses GitHub Actions for continuous integration. Every push to any branch, and every pull request, triggers the following automatically:</w:t>
+        <w:t xml:space="preserve">The project uses GitHub Actions. Every push to develop or main, and every pull request, runs these jobs (.github/workflows/ci.yml):</w:t>
+      </w:r>
+      <w:r>
+        <w:rPr>
+          <w:rtl w:val="0"/>
+        </w:rPr>
       </w:r>
     </w:p>
     <w:p>
@@ -7946,13 +8034,7 @@
           <w:bCs w:val="1"/>
           <w:rtl w:val="0"/>
         </w:rPr>
-        <w:t xml:space="preserve">Backend tests</w:t>
-      </w:r>
-      <w:r>
-        <w:rPr>
-          <w:rtl w:val="0"/>
-        </w:rPr>
-        <w:t xml:space="preserve"> — the full pytest suite, executed against in-memory SQLite, with a statement-coverage report produced on every run.</w:t>
+        <w:t xml:space="preserve">Backend lint — Ruff.</w:t>
       </w:r>
     </w:p>
     <w:p>
@@ -7970,13 +8052,7 @@
           <w:bCs w:val="1"/>
           <w:rtl w:val="0"/>
         </w:rPr>
-        <w:t xml:space="preserve">Backend lint</w:t>
-      </w:r>
-      <w:r>
-        <w:rPr>
-          <w:rtl w:val="0"/>
-        </w:rPr>
-        <w:t xml:space="preserve"> — Ruff, enforcing PEP 8 and checking for unused imports, import ordering, and a set of common defect patterns.</w:t>
+        <w:t xml:space="preserve">Backend tests (SQLite) — the full pytest suite with a coverage report; fails below 90% statement coverage.</w:t>
       </w:r>
     </w:p>
     <w:p>
@@ -7994,13 +8070,61 @@
           <w:bCs w:val="1"/>
           <w:rtl w:val="0"/>
         </w:rPr>
-        <w:t xml:space="preserve">Frontend build</w:t>
-      </w:r>
-      <w:r>
-        <w:rPr>
-          <w:rtl w:val="0"/>
-        </w:rPr>
-        <w:t xml:space="preserve"> — a clean dependency install followed by a production Vite build, so that a broken import or malformed component fails in the pipeline rather than on a team member’s machine.</w:t>
+        <w:t xml:space="preserve">Backend tests (PostgreSQL) — the same suite against PostgreSQL 18, the production database.</w:t>
+      </w:r>
+    </w:p>
+    <w:p>
+      <w:pPr>
+        <w:numPr>
+          <w:ilvl w:val="0"/>
+          <w:numId w:val="17"/>
+        </w:numPr>
+        <w:spacing w:after="0" w:afterAutospacing="0" w:before="0" w:beforeAutospacing="0" w:lineRule="auto"/>
+        <w:ind w:left="2160" w:hanging="360"/>
+      </w:pPr>
+      <w:r>
+        <w:rPr>
+          <w:b w:val="1"/>
+          <w:bCs w:val="1"/>
+          <w:rtl w:val="0"/>
+        </w:rPr>
+        <w:t xml:space="preserve">Migrations match the models — applies every migration to an empty database, checks that no model change lacks a migration, then downgrades to the base and upgrades again.</w:t>
+      </w:r>
+    </w:p>
+    <w:p>
+      <w:pPr>
+        <w:numPr>
+          <w:ilvl w:val="0"/>
+          <w:numId w:val="17"/>
+        </w:numPr>
+        <w:spacing w:after="0" w:afterAutospacing="0" w:before="0" w:beforeAutospacing="0" w:lineRule="auto"/>
+        <w:ind w:left="2160" w:hanging="360"/>
+      </w:pPr>
+      <w:r>
+        <w:rPr>
+          <w:b w:val="1"/>
+          <w:bCs w:val="1"/>
+          <w:rtl w:val="0"/>
+        </w:rPr>
+        <w:t xml:space="preserve">Frontend lint, test, build — ESLint, the Vitest suite with a 90% statement and line coverage gate, and a production Vite build.</w:t>
+      </w:r>
+    </w:p>
+    <w:p>
+      <w:pPr>
+        <w:numPr>
+          <w:ilvl w:val="0"/>
+          <w:numId w:val="17"/>
+        </w:numPr>
+        <w:spacing w:after="0" w:afterAutospacing="0" w:before="0" w:beforeAutospacing="0" w:lineRule="auto"/>
+        <w:ind w:left="2160" w:hanging="360"/>
+      </w:pPr>
+      <w:r>
+        <w:rPr>
+          <w:b w:val="1"/>
+          <w:bCs w:val="1"/>
+          <w:rtl w:val="0"/>
+        </w:rPr>
+        <w:t xml:space="preserve">Docker images and stack smoke test — builds both production images, scans them with Trivy, starts the full stack with Docker Compose, and checks that the health endpoint answers, migrations apply, and the frontend serves its page.</w:t>
       </w:r>
     </w:p>
     <w:p>
@@ -8018,13 +8142,12 @@
           <w:bCs w:val="1"/>
           <w:rtl w:val="0"/>
         </w:rPr>
-        <w:t xml:space="preserve">CodeQL analysis</w:t>
-      </w:r>
-      <w:r>
-        <w:rPr>
-          <w:rtl w:val="0"/>
-        </w:rPr>
-        <w:t xml:space="preserve"> — static security and quality analysis over both languages.</w:t>
+        <w:t xml:space="preserve">CI passed — one required check that succeeds only when every job above has passed.</w:t>
+      </w:r>
+      <w:r>
+        <w:rPr>
+          <w:rtl w:val="0"/>
+        </w:rPr>
       </w:r>
     </w:p>
     <w:p>
@@ -8037,35 +8160,7 @@
         <w:rPr>
           <w:rtl w:val="0"/>
         </w:rPr>
-        <w:t xml:space="preserve">A pull request cannot be merged into the integration branch until the required checks pass and a peer review has been approved. After review, changes merge into </w:t>
-      </w:r>
-      <w:r>
-        <w:rPr>
-          <w:rFonts w:ascii="Roboto Mono" w:cs="Roboto Mono" w:eastAsia="Roboto Mono" w:hAnsi="Roboto Mono"/>
-          <w:color w:val="188038"/>
-          <w:rtl w:val="0"/>
-        </w:rPr>
-        <w:t xml:space="preserve">develop</w:t>
-      </w:r>
-      <w:r>
-        <w:rPr>
-          <w:rtl w:val="0"/>
-        </w:rPr>
-        <w:t xml:space="preserve"> for integration testing; once validated there, they are promoted to </w:t>
-      </w:r>
-      <w:r>
-        <w:rPr>
-          <w:rFonts w:ascii="Roboto Mono" w:cs="Roboto Mono" w:eastAsia="Roboto Mono" w:hAnsi="Roboto Mono"/>
-          <w:color w:val="188038"/>
-          <w:rtl w:val="0"/>
-        </w:rPr>
-        <w:t xml:space="preserve">main</w:t>
-      </w:r>
-      <w:r>
-        <w:rPr>
-          <w:rtl w:val="0"/>
-        </w:rPr>
-        <w:t xml:space="preserve"> by pull request.</w:t>
+        <w:t xml:space="preserve">CodeQL (.github/workflows/codeql.yml) runs static analysis over the Python and JavaScript sources on pull requests and on pushes to develop and main.</w:t>
       </w:r>
     </w:p>
     <w:p>
@@ -8076,6 +8171,24 @@
       </w:pPr>
       <w:r>
         <w:rPr>
+          <w:rtl w:val="0"/>
+        </w:rPr>
+        <w:t xml:space="preserve">A pull request cannot merge into develop or main until “CI passed” is green and another member has approved it. Changes merge into develop for integration testing and are promoted to main by a release pull request.</w:t>
+      </w:r>
+      <w:r>
+        <w:rPr>
+          <w:rtl w:val="0"/>
+        </w:rPr>
+      </w:r>
+    </w:p>
+    <w:p>
+      <w:pPr>
+        <w:spacing w:after="240" w:before="240" w:lineRule="auto"/>
+        <w:ind w:left="1440" w:firstLine="0"/>
+        <w:rPr/>
+      </w:pPr>
+      <w:r>
+        <w:rPr>
           <w:b w:val="1"/>
           <w:bCs w:val="1"/>
           <w:rtl w:val="0"/>
@@ -8086,7 +8199,18 @@
         <w:rPr>
           <w:rtl w:val="0"/>
         </w:rPr>
-        <w:t xml:space="preserve"> The application is deployed and demonstrated locally using Docker Compose. A single command builds and starts the database, backend, and frontend together, and the resulting environment is identical for every team member. Hosted deployment to a cloud or Kubernetes environment is outside the scope of this project; the containerized build is structured so that it would not be precluded in future work.</w:t>
+        <w:t xml:space="preserve"> </w:t>
+      </w:r>
+      <w:r>
+        <w:rPr>
+          <w:rtl w:val="0"/>
+        </w:rPr>
+        <w:t xml:space="preserve">After CI passes on develop or main, the CD workflow (.github/workflows/cd.yml) publishes both images to GitHub Container Registry, tagged with the commit SHA. The workflow and render.yaml define a Render staging environment (from develop) and production (from main), but the Render deploy hooks have not been configured, so the deploy step is currently skipped. The application is demonstrated locally with Docker Compose, where one command builds and starts the database, backend, and frontend.</w:t>
+      </w:r>
+      <w:r>
+        <w:rPr>
+          <w:rtl w:val="0"/>
+        </w:rPr>
       </w:r>
     </w:p>
     <w:p>
@@ -8422,7 +8546,7 @@
                 <w:bCs w:val="1"/>
                 <w:rtl w:val="0"/>
               </w:rPr>
-              <w:t xml:space="preserve">Current: 100% — 94 of 94 tests passing.</w:t>
+              <w:t xml:space="preserve">Current (Iteration 2): 100%: 201 backend tests on both SQLite and PostgreSQL, and 174 frontend tests.</w:t>
             </w:r>
             <w:r>
               <w:rPr>
@@ -8531,21 +8655,7 @@
                 <w:bCs w:val="1"/>
                 <w:rtl w:val="0"/>
               </w:rPr>
-              <w:t xml:space="preserve">Target: above 70% overall statement coverage.</w:t>
-            </w:r>
-            <w:r>
-              <w:rPr>
-                <w:rtl w:val="0"/>
-              </w:rPr>
-              <w:t xml:space="preserve"> Measured by pytest-cov and reported in every CI run. </w:t>
-            </w:r>
-            <w:r>
-              <w:rPr>
-                <w:b w:val="1"/>
-                <w:bCs w:val="1"/>
-                <w:rtl w:val="0"/>
-              </w:rPr>
-              <w:t xml:space="preserve">Current: 96% across 448 statements.</w:t>
+              <w:t xml:space="preserve">Target: at least 90%, enforced separately by CI for the backend (pytest-cov) and the frontend (Vitest). Current (Iteration 2): backend 97.02%, frontend 91.66%.</w:t>
             </w:r>
             <w:r>
               <w:rPr>
@@ -9275,39 +9385,6 @@
     </w:p>
     <w:p>
       <w:pPr>
-        <w:ind w:left="1440" w:firstLine="0"/>
-        <w:rPr>
-          <w:b w:val="1"/>
-          <w:bCs w:val="1"/>
-          <w:i w:val="1"/>
-          <w:iCs w:val="1"/>
-        </w:rPr>
-      </w:pPr>
-      <w:r>
-        <w:rPr>
-          <w:b w:val="1"/>
-          <w:bCs w:val="1"/>
-          <w:i w:val="1"/>
-          <w:iCs w:val="1"/>
-          <w:rtl w:val="0"/>
-        </w:rPr>
-        <w:t xml:space="preserve">Code Review Model &amp; Roles</w:t>
-      </w:r>
-    </w:p>
-    <w:p>
-      <w:pPr>
-        <w:ind w:left="1440" w:firstLine="0"/>
-        <w:rPr/>
-      </w:pPr>
-      <w:r>
-        <w:rPr>
-          <w:rtl w:val="0"/>
-        </w:rPr>
-        <w:t xml:space="preserve">We will adopt a Peer-to-Peer with Lead Oversight Model:</w:t>
-      </w:r>
-    </w:p>
-    <w:p>
-      <w:pPr>
         <w:spacing w:after="240" w:lineRule="auto"/>
         <w:ind w:left="2160" w:firstLine="0"/>
         <w:rPr>
@@ -10050,7 +10127,18 @@
         <w:rPr>
           <w:rtl w:val="0"/>
         </w:rPr>
-        <w:t xml:space="preserve"> Does the file meet our overall 70% coverage target </w:t>
+        <w:t xml:space="preserve"> </w:t>
+      </w:r>
+      <w:r>
+        <w:rPr>
+          <w:rtl w:val="0"/>
+        </w:rPr>
+        <w:t xml:space="preserve">Does the change keep backend and frontend coverage at or above 90%?</w:t>
+      </w:r>
+      <w:r>
+        <w:rPr>
+          <w:rtl w:val="0"/>
+        </w:rPr>
       </w:r>
     </w:p>
     <w:p>
@@ -10936,27 +11024,12 @@
           <w:bCs w:val="1"/>
           <w:rtl w:val="0"/>
         </w:rPr>
-        <w:t xml:space="preserve">Frontend test execution:</w:t>
-      </w:r>
-      <w:r>
-        <w:rPr>
-          <w:rtl w:val="0"/>
-        </w:rPr>
-        <w:t xml:space="preserve"> the Node.js built-in test runner (</w:t>
-      </w:r>
-      <w:r>
-        <w:rPr>
-          <w:rFonts w:ascii="Roboto Mono" w:cs="Roboto Mono" w:eastAsia="Roboto Mono" w:hAnsi="Roboto Mono"/>
-          <w:color w:val="188038"/>
-          <w:rtl w:val="0"/>
-        </w:rPr>
-        <w:t xml:space="preserve">node --test</w:t>
-      </w:r>
-      <w:r>
-        <w:rPr>
-          <w:rtl w:val="0"/>
-        </w:rPr>
-        <w:t xml:space="preserve">), used for the frontend’s data-layer tests. A component-rendering framework has not been adopted; frontend behaviour is otherwise verified by the production build and by manual acceptance testing.</w:t>
+        <w:t xml:space="preserve">Frontend test execution: Vitest with React Testing Library, for unit tests of the API clients and pure helpers and for component tests of every page. Coverage is measured with @vitest/coverage-v8, and CI fails below 90%. End-to-end checks remain a manual walkthrough in the browser; no browser automation is used.</w:t>
+      </w:r>
+      <w:r>
+        <w:rPr>
+          <w:rtl w:val="0"/>
+        </w:rPr>
       </w:r>
     </w:p>
     <w:p>
@@ -10967,6 +11040,14 @@
         </w:numPr>
         <w:ind w:left="2160" w:hanging="360"/>
       </w:pPr>
+      <w:r>
+        <w:rPr>
+          <w:b w:val="1"/>
+          <w:bCs w:val="1"/>
+          <w:rtl w:val="0"/>
+        </w:rPr>
+        <w:t xml:space="preserve">(With AI generation, Iteration 3.) </w:t>
+      </w:r>
       <w:r>
         <w:rPr>
           <w:b w:val="1"/>
@@ -11383,7 +11464,7 @@
               <w:rPr>
                 <w:rtl w:val="0"/>
               </w:rPr>
-              <w:t xml:space="preserve">CI Integration &amp; API Schema Verification</w:t>
+              <w:t xml:space="preserve">Study mode: scheduler, API, and component tests</w:t>
             </w:r>
           </w:p>
         </w:tc>
@@ -11413,7 +11494,7 @@
               <w:rPr>
                 <w:rtl w:val="0"/>
               </w:rPr>
-              <w:t xml:space="preserve">White-box unit tests covering the SM-2 interval and ease-factor calculations across all rating paths and boundary conditions. Integration tests for the study and generation endpoints. Validation tests confirming that malformed model output is rejected before any database write.</w:t>
+              <w:t xml:space="preserve">Unit tests of the scheduler against reference values from Anki’s algorithm, covering every state and rating, overdue reviews, and the ease floor. Integration tests for the due-cards and review endpoints: session limits, the learn-ahead window, early answers (409), and cross-user access. Component tests for every page with React Testing Library, and a 90% frontend coverage gate. A manual walkthrough of study mode on a fresh database. Result: 201 backend tests at 97.02% and 174 frontend tests at 91.66%, all passing.</w:t>
             </w:r>
           </w:p>
         </w:tc>
@@ -11490,7 +11571,7 @@
               <w:rPr>
                 <w:rtl w:val="0"/>
               </w:rPr>
-              <w:t xml:space="preserve">Full End-to-End System Integration &amp; Release</w:t>
+              <w:t xml:space="preserve">AI generation, system testing, and release</w:t>
             </w:r>
           </w:p>
         </w:tc>
@@ -11520,7 +11601,7 @@
               <w:rPr>
                 <w:rtl w:val="0"/>
               </w:rPr>
-              <w:t xml:space="preserve">Full automated and manual integration testing across frontend, backend, database, and the LLM integration. Complete regression sweeps. Manual acceptance testing of every essential user story. Final release verification.</w:t>
+              <w:t xml:space="preserve">Unit and integration tests for AI generation against a simulated provider: malformed, incomplete, and oversized output rejected before any database write; timeouts and rate limits. Scripted timing tests for the performance requirements. Full regression run, manual acceptance testing of every essential story, and final release verification.</w:t>
             </w:r>
           </w:p>
         </w:tc>
@@ -11634,10 +11715,21 @@
       </w:r>
       <w:r>
         <w:rPr>
+          <w:rtl w:val="0"/>
+        </w:rPr>
+        <w:t xml:space="preserve"> </w:t>
+      </w:r>
+      <w:r>
+        <w:rPr>
           <w:rFonts w:ascii="Arial Unicode MS" w:cs="Arial Unicode MS" w:eastAsia="Arial Unicode MS" w:hAnsi="Arial Unicode MS"/>
           <w:rtl w:val="0"/>
         </w:rPr>
-        <w:t xml:space="preserve"> Defects are tracked as GitHub Issues in the project repository, labelled by severity and linked to the pull request that resolves them. Issues move through the stages Backlog → To Do → In Progress → In Review → Closed. Day-to-day coordination happens in the team group chat; issues are the durable record, so that a defect and its resolution remain traceable after the conversation has scrolled away.</w:t>
+        <w:t xml:space="preserve">Defects are tracked as Bug issues in Jira, linked to the story they affect and to the pull request that fixes them, and move through To Do → In Progress → In Review → Done. A defect caught in code review before merging is recorded in the review and fixed in the same pull request. Day-to-day coordination happens in the team’s Discord channel; Jira is the durable record.</w:t>
+      </w:r>
+      <w:r>
+        <w:rPr>
+          <w:rtl w:val="0"/>
+        </w:rPr>
       </w:r>
     </w:p>
     <w:p>
@@ -14072,6 +14164,202 @@
           </w:p>
         </w:tc>
       </w:tr>
+      <w:tr>
+        <w:trPr>
+          <w:cantSplit w:val="0"/>
+          <w:tblHeader w:val="0"/>
+        </w:trPr>
+        <w:tc>
+          <w:tcPr>
+            <w:shd w:fill="auto" w:val="clear"/>
+            <w:tcMar>
+              <w:top w:w="100.0" w:type="dxa"/>
+              <w:left w:w="100.0" w:type="dxa"/>
+              <w:bottom w:w="100.0" w:type="dxa"/>
+              <w:right w:w="100.0" w:type="dxa"/>
+            </w:tcMar>
+            <w:vAlign w:val="top"/>
+          </w:tcPr>
+          <w:p>
+            <w:pPr>
+              <w:keepNext w:val="0"/>
+              <w:keepLines w:val="0"/>
+              <w:pageBreakBefore w:val="0"/>
+              <w:widowControl w:val="0"/>
+              <w:pBdr>
+                <w:top w:space="0" w:sz="0" w:val="nil"/>
+                <w:left w:space="0" w:sz="0" w:val="nil"/>
+                <w:bottom w:space="0" w:sz="0" w:val="nil"/>
+                <w:right w:space="0" w:sz="0" w:val="nil"/>
+                <w:between w:space="0" w:sz="0" w:val="nil"/>
+              </w:pBdr>
+              <w:shd w:fill="auto" w:val="clear"/>
+              <w:spacing w:after="0" w:before="0" w:line="240" w:lineRule="auto"/>
+              <w:ind w:left="0" w:right="0" w:firstLine="0"/>
+              <w:jc w:val="left"/>
+              <w:rPr/>
+            </w:pPr>
+            <w:r>
+              <w:rPr>
+                <w:rtl w:val="0"/>
+              </w:rPr>
+              <w:t xml:space="preserve">Iteration 2 revision (timeline, configuration management, CI/CD, QA plan, defect management)</w:t>
+            </w:r>
+          </w:p>
+        </w:tc>
+        <w:tc>
+          <w:tcPr>
+            <w:shd w:fill="auto" w:val="clear"/>
+            <w:tcMar>
+              <w:top w:w="100.0" w:type="dxa"/>
+              <w:left w:w="100.0" w:type="dxa"/>
+              <w:bottom w:w="100.0" w:type="dxa"/>
+              <w:right w:w="100.0" w:type="dxa"/>
+            </w:tcMar>
+            <w:vAlign w:val="top"/>
+          </w:tcPr>
+          <w:p>
+            <w:pPr>
+              <w:keepNext w:val="0"/>
+              <w:keepLines w:val="0"/>
+              <w:pageBreakBefore w:val="0"/>
+              <w:widowControl w:val="0"/>
+              <w:pBdr>
+                <w:top w:space="0" w:sz="0" w:val="nil"/>
+                <w:left w:space="0" w:sz="0" w:val="nil"/>
+                <w:bottom w:space="0" w:sz="0" w:val="nil"/>
+                <w:right w:space="0" w:sz="0" w:val="nil"/>
+                <w:between w:space="0" w:sz="0" w:val="nil"/>
+              </w:pBdr>
+              <w:shd w:fill="auto" w:val="clear"/>
+              <w:spacing w:after="0" w:before="0" w:line="240" w:lineRule="auto"/>
+              <w:ind w:left="0" w:right="0" w:firstLine="0"/>
+              <w:jc w:val="left"/>
+              <w:rPr/>
+            </w:pPr>
+            <w:r>
+              <w:rPr>
+                <w:rtl w:val="0"/>
+              </w:rPr>
+              <w:t xml:space="preserve">Duc</w:t>
+            </w:r>
+          </w:p>
+        </w:tc>
+        <w:tc>
+          <w:tcPr>
+            <w:shd w:fill="auto" w:val="clear"/>
+            <w:tcMar>
+              <w:top w:w="100.0" w:type="dxa"/>
+              <w:left w:w="100.0" w:type="dxa"/>
+              <w:bottom w:w="100.0" w:type="dxa"/>
+              <w:right w:w="100.0" w:type="dxa"/>
+            </w:tcMar>
+            <w:vAlign w:val="top"/>
+          </w:tcPr>
+          <w:p>
+            <w:pPr>
+              <w:keepNext w:val="0"/>
+              <w:keepLines w:val="0"/>
+              <w:pageBreakBefore w:val="0"/>
+              <w:widowControl w:val="0"/>
+              <w:pBdr>
+                <w:top w:space="0" w:sz="0" w:val="nil"/>
+                <w:left w:space="0" w:sz="0" w:val="nil"/>
+                <w:bottom w:space="0" w:sz="0" w:val="nil"/>
+                <w:right w:space="0" w:sz="0" w:val="nil"/>
+                <w:between w:space="0" w:sz="0" w:val="nil"/>
+              </w:pBdr>
+              <w:shd w:fill="auto" w:val="clear"/>
+              <w:spacing w:after="0" w:before="0" w:line="240" w:lineRule="auto"/>
+              <w:ind w:left="0" w:right="0" w:firstLine="0"/>
+              <w:jc w:val="left"/>
+              <w:rPr/>
+            </w:pPr>
+            <w:r>
+              <w:rPr>
+                <w:rtl w:val="0"/>
+              </w:rPr>
+              <w:t xml:space="preserve">70%</w:t>
+            </w:r>
+          </w:p>
+        </w:tc>
+        <w:tc>
+          <w:tcPr>
+            <w:shd w:fill="auto" w:val="clear"/>
+            <w:tcMar>
+              <w:top w:w="100.0" w:type="dxa"/>
+              <w:left w:w="100.0" w:type="dxa"/>
+              <w:bottom w:w="100.0" w:type="dxa"/>
+              <w:right w:w="100.0" w:type="dxa"/>
+            </w:tcMar>
+            <w:vAlign w:val="top"/>
+          </w:tcPr>
+          <w:p>
+            <w:pPr>
+              <w:keepNext w:val="0"/>
+              <w:keepLines w:val="0"/>
+              <w:pageBreakBefore w:val="0"/>
+              <w:widowControl w:val="0"/>
+              <w:pBdr>
+                <w:top w:space="0" w:sz="0" w:val="nil"/>
+                <w:left w:space="0" w:sz="0" w:val="nil"/>
+                <w:bottom w:space="0" w:sz="0" w:val="nil"/>
+                <w:right w:space="0" w:sz="0" w:val="nil"/>
+                <w:between w:space="0" w:sz="0" w:val="nil"/>
+              </w:pBdr>
+              <w:shd w:fill="auto" w:val="clear"/>
+              <w:spacing w:after="0" w:before="0" w:line="240" w:lineRule="auto"/>
+              <w:ind w:left="0" w:right="0" w:firstLine="0"/>
+              <w:jc w:val="left"/>
+              <w:rPr/>
+            </w:pPr>
+            <w:r>
+              <w:rPr>
+                <w:rtl w:val="0"/>
+              </w:rPr>
+              <w:t xml:space="preserve">Claude Code compared the SPPP with the repository (CI workflows, tests, Iteration 2 plan, pull request history) and the Iteration 1 feedback, then drafted replacement text. Why AI: the work is a line-by-line comparison of a long document against the code, which is slow and error-prone by hand. I chose which changes to make and edited the drafts.</w:t>
+            </w:r>
+          </w:p>
+        </w:tc>
+        <w:tc>
+          <w:tcPr>
+            <w:shd w:fill="auto" w:val="clear"/>
+            <w:tcMar>
+              <w:top w:w="100.0" w:type="dxa"/>
+              <w:left w:w="100.0" w:type="dxa"/>
+              <w:bottom w:w="100.0" w:type="dxa"/>
+              <w:right w:w="100.0" w:type="dxa"/>
+            </w:tcMar>
+            <w:vAlign w:val="top"/>
+          </w:tcPr>
+          <w:p>
+            <w:pPr>
+              <w:keepNext w:val="0"/>
+              <w:keepLines w:val="0"/>
+              <w:pageBreakBefore w:val="0"/>
+              <w:widowControl w:val="0"/>
+              <w:pBdr>
+                <w:top w:space="0" w:sz="0" w:val="nil"/>
+                <w:left w:space="0" w:sz="0" w:val="nil"/>
+                <w:bottom w:space="0" w:sz="0" w:val="nil"/>
+                <w:right w:space="0" w:sz="0" w:val="nil"/>
+                <w:between w:space="0" w:sz="0" w:val="nil"/>
+              </w:pBdr>
+              <w:shd w:fill="auto" w:val="clear"/>
+              <w:spacing w:after="0" w:before="0" w:line="240" w:lineRule="auto"/>
+              <w:ind w:left="0" w:right="0" w:firstLine="0"/>
+              <w:jc w:val="left"/>
+              <w:rPr/>
+            </w:pPr>
+            <w:r>
+              <w:rPr>
+                <w:rtl w:val="0"/>
+              </w:rPr>
+              <w:t xml:space="preserve">Checked each number against CI run 37337765004 and each tool claim against .github/workflows</w:t>
+            </w:r>
+          </w:p>
+        </w:tc>
+      </w:tr>
     </w:tbl>
     <w:p>
       <w:pPr>
@@ -14168,22 +14456,7 @@
         <w:rPr>
           <w:rtl w:val="0"/>
         </w:rPr>
-        <w:t xml:space="preserve">Project management tool link (Github issues page): </w:t>
-      </w:r>
-      <w:hyperlink r:id="rId10">
-        <w:r>
-          <w:rPr>
-            <w:color w:val="1155cc"/>
-            <w:u w:val="single"/>
-            <w:rtl w:val="0"/>
-          </w:rPr>
-          <w:t xml:space="preserve">https://github.com/BUMETCS673/CS673OLF26P2/issues</w:t>
-        </w:r>
-      </w:hyperlink>
-      <w:r>
-        <w:rPr>
-          <w:rtl w:val="0"/>
-        </w:rPr>
+        <w:t xml:space="preserve">Project management tool link (Jira): project SCRUM</w:t>
       </w:r>
     </w:p>
     <w:p>
@@ -14544,7 +14817,7 @@
         </w:rPr>
         <w:t xml:space="preserve">OWASP Foundation. OWASP Top 10. </w:t>
       </w:r>
-      <w:hyperlink r:id="rId11">
+      <w:hyperlink r:id="rId10">
         <w:r>
           <w:rPr>
             <w:color w:val="1155cc"/>
@@ -14680,7 +14953,7 @@
         <w:rPr>
           <w:rtl w:val="0"/>
         </w:rPr>
-        <w:t xml:space="preserve">DAST — Dynamic Application Security Testing. Security testing performed against a running application.</w:t>
+        <w:t xml:space="preserve">DevOps — Development and Operations. Practices that combine software development with IT operations to shorten and automate the delivery cycle.</w:t>
       </w:r>
     </w:p>
     <w:p>
@@ -14692,7 +14965,7 @@
         <w:rPr>
           <w:rtl w:val="0"/>
         </w:rPr>
-        <w:t xml:space="preserve">DevOps — Development and Operations. Practices that combine software development with IT operations to shorten and automate the delivery cycle.</w:t>
+        <w:t xml:space="preserve">IDE — Integrated Development Environment. An application providing code editing, debugging, and build tooling in one interface.</w:t>
       </w:r>
     </w:p>
     <w:p>
@@ -14704,7 +14977,7 @@
         <w:rPr>
           <w:rtl w:val="0"/>
         </w:rPr>
-        <w:t xml:space="preserve">GitOps — An operational model in which the desired system state is stored in Git and automatically synchronized to the runtime environment.</w:t>
+        <w:t xml:space="preserve">JSON — JavaScript Object Notation. The data-interchange format used for API payloads and structured LLM output.</w:t>
       </w:r>
     </w:p>
     <w:p>
@@ -14716,7 +14989,7 @@
         <w:rPr>
           <w:rtl w:val="0"/>
         </w:rPr>
-        <w:t xml:space="preserve">IDE — Integrated Development Environment. An application providing code editing, debugging, and build tooling in one interface.</w:t>
+        <w:t xml:space="preserve">LLM — Large Language Model. The generative AI model used to author flashcard content.</w:t>
       </w:r>
     </w:p>
     <w:p>
@@ -14728,7 +15001,7 @@
         <w:rPr>
           <w:rtl w:val="0"/>
         </w:rPr>
-        <w:t xml:space="preserve">JSON — JavaScript Object Notation. The data-interchange format used for API payloads and structured LLM output.</w:t>
+        <w:t xml:space="preserve">OWASP — Open Worldwide Application Security Project. A nonprofit producing widely used application security resources.</w:t>
       </w:r>
     </w:p>
     <w:p>
@@ -14740,7 +15013,7 @@
         <w:rPr>
           <w:rtl w:val="0"/>
         </w:rPr>
-        <w:t xml:space="preserve">LLM — Large Language Model. The generative AI model used to author flashcard content.</w:t>
+        <w:t xml:space="preserve">PEP 8 — Python Enhancement Proposal 8. The official Python style guide, adopted as our Python coding standard.</w:t>
       </w:r>
     </w:p>
     <w:p>
@@ -14752,7 +15025,7 @@
         <w:rPr>
           <w:rtl w:val="0"/>
         </w:rPr>
-        <w:t xml:space="preserve">OWASP — Open Worldwide Application Security Project. A nonprofit producing widely used application security resources.</w:t>
+        <w:t xml:space="preserve">PR — Pull Request. A proposed set of changes submitted for review before merging.</w:t>
       </w:r>
     </w:p>
     <w:p>
@@ -14764,7 +15037,7 @@
         <w:rPr>
           <w:rtl w:val="0"/>
         </w:rPr>
-        <w:t xml:space="preserve">PEP 8 — Python Enhancement Proposal 8. The official Python style guide, adopted as our Python coding standard.</w:t>
+        <w:t xml:space="preserve">REST — Representational State Transfer. The architectural style used for the backend API.</w:t>
       </w:r>
     </w:p>
     <w:p>
@@ -14776,7 +15049,7 @@
         <w:rPr>
           <w:rtl w:val="0"/>
         </w:rPr>
-        <w:t xml:space="preserve">PR — Pull Request. A proposed set of changes submitted for review before merging.</w:t>
+        <w:t xml:space="preserve">SAST — Static Application Security Testing. Security analysis of source code without executing it.</w:t>
       </w:r>
     </w:p>
     <w:p>
@@ -14788,7 +15061,7 @@
         <w:rPr>
           <w:rtl w:val="0"/>
         </w:rPr>
-        <w:t xml:space="preserve">REST — Representational State Transfer. The architectural style used for the backend API.</w:t>
+        <w:t xml:space="preserve">SPPP — Software Project Proposal and Planning. This document.</w:t>
       </w:r>
     </w:p>
     <w:p>
@@ -14800,7 +15073,7 @@
         <w:rPr>
           <w:rtl w:val="0"/>
         </w:rPr>
-        <w:t xml:space="preserve">SAST — Static Application Security Testing. Security analysis of source code without executing it.</w:t>
+        <w:t xml:space="preserve">SRS — Spaced Repetition System. The scheduling engine that determines when each card is next reviewed.</w:t>
       </w:r>
     </w:p>
     <w:p>
@@ -14812,7 +15085,7 @@
         <w:rPr>
           <w:rtl w:val="0"/>
         </w:rPr>
-        <w:t xml:space="preserve">SPPP — Software Project Proposal and Planning. This document.</w:t>
+        <w:t xml:space="preserve">UAT — User Acceptance Testing. Manual validation that delivered features meet their acceptance criteria.</w:t>
       </w:r>
     </w:p>
     <w:p>
@@ -14824,43 +15097,7 @@
         <w:rPr>
           <w:rtl w:val="0"/>
         </w:rPr>
-        <w:t xml:space="preserve">SRS — Spaced Repetition System. The scheduling engine that determines when each card is next reviewed.</w:t>
-      </w:r>
-    </w:p>
-    <w:p>
-      <w:pPr>
-        <w:ind w:left="720" w:firstLine="0"/>
-        <w:rPr/>
-      </w:pPr>
-      <w:r>
-        <w:rPr>
-          <w:rtl w:val="0"/>
-        </w:rPr>
-        <w:t xml:space="preserve">UAT — User Acceptance Testing. Manual validation that delivered features meet their acceptance criteria.</w:t>
-      </w:r>
-    </w:p>
-    <w:p>
-      <w:pPr>
-        <w:ind w:left="720" w:firstLine="0"/>
-        <w:rPr/>
-      </w:pPr>
-      <w:r>
-        <w:rPr>
-          <w:rtl w:val="0"/>
-        </w:rPr>
         <w:t xml:space="preserve">UI / UX — User Interface / User Experience.</w:t>
-      </w:r>
-    </w:p>
-    <w:p>
-      <w:pPr>
-        <w:ind w:left="720" w:firstLine="0"/>
-        <w:rPr/>
-      </w:pPr>
-      <w:r>
-        <w:rPr>
-          <w:rtl w:val="0"/>
-        </w:rPr>
-        <w:t xml:space="preserve">ZAP — Zed Attack Proxy. The OWASP DAST tool used to scan the running application.</w:t>
       </w:r>
     </w:p>
     <w:p>
@@ -14997,7 +15234,7 @@
       </w:r>
     </w:p>
     <w:sectPr>
-      <w:headerReference r:id="rId12" w:type="default"/>
+      <w:headerReference r:id="rId11" w:type="default"/>
       <w:pgSz w:h="15840" w:w="12240" w:orient="portrait"/>
       <w:pgMar w:bottom="1440" w:top="1440" w:left="1440" w:right="1080" w:header="0" w:footer="720"/>
       <w:pgNumType w:start="1"/>

</xml_diff>